<commit_message>
Add Zenodo analysis code DOI to manuscript
</commit_message>
<xml_diff>
--- a/own-article/paper/en/paper_en.docx
+++ b/own-article/paper/en/paper_en.docx
@@ -53050,7 +53050,7 @@
         <w:t xml:space="preserve"> </w:t>
       </w:r>
       <w:r>
-        <w:t xml:space="preserve">together with the git commit of the generating code. The archived replication package</w:t>
+        <w:t xml:space="preserve">together with the git commit of the generating code. The replication tree used to prepare this manuscript</w:t>
       </w:r>
       <w:r>
         <w:t xml:space="preserve"> </w:t>
@@ -53141,7 +53141,7 @@
         </w:r>
       </w:hyperlink>
       <w:r>
-        <w:t xml:space="preserve">).</w:t>
+        <w:t xml:space="preserve">). Analysis code: https://doi.org/10.5281/zenodo.22939740. The record does not include per-run result tables.</w:t>
       </w:r>
       <w:r>
         <w:t xml:space="preserve"> </w:t>

</xml_diff>

<commit_message>
Move Elena Chernyaeva to fourth author position
</commit_message>
<xml_diff>
--- a/own-article/paper/en/paper_en.docx
+++ b/own-article/paper/en/paper_en.docx
@@ -157,7 +157,7 @@
           <w:b/>
           <w:bCs/>
         </w:rPr>
-        <w:t xml:space="preserve">Mariya S. Kilina</w:t>
+        <w:t xml:space="preserve">Elena O. Chernyaeva</w:t>
       </w:r>
       <m:oMath>
         <m:sSup>
@@ -168,11 +168,23 @@
           </m:e>
           <m:sup>
             <m:r>
-              <m:t>2</m:t>
+              <m:t>1</m:t>
             </m:r>
           </m:sup>
         </m:sSup>
       </m:oMath>
+      <w:r>
+        <w:t xml:space="preserve"> </w:t>
+      </w:r>
+      <w:r>
+        <w:t xml:space="preserve"> </w:t>
+      </w:r>
+      <w:r>
+        <w:rPr>
+          <w:vertAlign w:val="superscript"/>
+        </w:rPr>
+        <w:t xml:space="preserve">0009-0003-3829-3486</w:t>
+      </w:r>
     </w:p>
     <w:p>
       <w:pPr>
@@ -183,7 +195,7 @@
           <w:b/>
           <w:bCs/>
         </w:rPr>
-        <w:t xml:space="preserve">Marina M. Zhdanova</w:t>
+        <w:t xml:space="preserve">Mariya S. Kilina</w:t>
       </w:r>
       <m:oMath>
         <m:sSup>
@@ -194,23 +206,11 @@
           </m:e>
           <m:sup>
             <m:r>
-              <m:t>3</m:t>
+              <m:t>2</m:t>
             </m:r>
           </m:sup>
         </m:sSup>
       </m:oMath>
-      <w:r>
-        <w:t xml:space="preserve"> </w:t>
-      </w:r>
-      <w:r>
-        <w:t xml:space="preserve"> </w:t>
-      </w:r>
-      <w:r>
-        <w:rPr>
-          <w:vertAlign w:val="superscript"/>
-        </w:rPr>
-        <w:t xml:space="preserve">0000-0003-1119-5221</w:t>
-      </w:r>
     </w:p>
     <w:p>
       <w:pPr>
@@ -221,7 +221,7 @@
           <w:b/>
           <w:bCs/>
         </w:rPr>
-        <w:t xml:space="preserve">Elena O. Chernyaeva</w:t>
+        <w:t xml:space="preserve">Marina M. Zhdanova</w:t>
       </w:r>
       <m:oMath>
         <m:sSup>
@@ -232,7 +232,7 @@
           </m:e>
           <m:sup>
             <m:r>
-              <m:t>1</m:t>
+              <m:t>3</m:t>
             </m:r>
           </m:sup>
         </m:sSup>
@@ -247,7 +247,7 @@
         <w:rPr>
           <w:vertAlign w:val="superscript"/>
         </w:rPr>
-        <w:t xml:space="preserve">0009-0003-3829-3486</w:t>
+        <w:t xml:space="preserve">0000-0003-1119-5221</w:t>
       </w:r>
     </w:p>
     <w:p>

</xml_diff>

<commit_message>
Complete manuscript data availability and repair Word table layout
</commit_message>
<xml_diff>
--- a/own-article/paper/en/paper_en.docx
+++ b/own-article/paper/en/paper_en.docx
@@ -8436,13 +8436,13 @@
         <w:t xml:space="preserve">EXPERIMENT_PROTOCOL.md</w:t>
       </w:r>
       <w:r>
-        <w:t xml:space="preserve">, is included in the archived</w:t>
-      </w:r>
-      <w:r>
-        <w:t xml:space="preserve"> </w:t>
-      </w:r>
-      <w:r>
-        <w:t xml:space="preserve">replication package named in the Data Availability Statement.</w:t>
+        <w:t xml:space="preserve">, is included in the public replication tree linked in the Data Availability Statement.</w:t>
+      </w:r>
+      <w:r>
+        <w:t xml:space="preserve"/>
+      </w:r>
+      <w:r>
+        <w:t xml:space="preserve"/>
       </w:r>
       <w:r>
         <w:t xml:space="preserve"> </w:t>
@@ -16076,23 +16076,24 @@
     </w:p>
     <w:tbl>
       <w:tblPr>
-        <w:tblStyle w:val="Table"/>
         <w:tblW w:type="auto" w:w="0"/>
-        <w:tblLook w:firstRow="1" w:lastRow="0" w:firstColumn="0" w:lastColumn="0" w:noHBand="0" w:noVBand="0" w:val="0020"/>
-        <w:tblCaption w:val="Tuning the rule-based reference under the reinforcement-learning agents’ budget (16 random trials plus the hard-coded configuration as trial 0; selection on 2018–2019 only). EPI in EUR m^{-2}; one deterministic run per season. Source: regen/results/n2_tune/tune_rb_n2.csv."/>
+        <w:tblLayout w:type="fixed"/>
+        <w:tblLook w:firstColumn="1" w:firstRow="1" w:lastColumn="0" w:lastRow="0" w:noHBand="0" w:noVBand="1" w:val="04A0"/>
       </w:tblPr>
       <w:tblGrid>
-        <w:gridCol w:w="1980"/>
-        <w:gridCol w:w="1980"/>
-        <w:gridCol w:w="1980"/>
-        <w:gridCol w:w="1980"/>
+        <w:gridCol w:w="2580"/>
+        <w:gridCol w:w="1020"/>
+        <w:gridCol w:w="1020"/>
+        <w:gridCol w:w="1020"/>
+        <w:gridCol w:w="1020"/>
+        <w:gridCol w:w="1020"/>
+        <w:gridCol w:w="1531"/>
       </w:tblGrid>
       <w:tr>
-        <w:trPr>
-          <w:tblHeader w:val="on"/>
-        </w:trPr>
-        <w:tc>
-          <w:tcPr/>
+        <w:tc>
+          <w:tcPr>
+            <w:tcW w:type="dxa" w:w="2580"/>
+          </w:tcPr>
           <w:p>
             <w:pPr>
               <w:pStyle w:val="Compact"/>
@@ -16104,7 +16105,10 @@
           </w:p>
         </w:tc>
         <w:tc>
-          <w:tcPr/>
+          <w:tcPr>
+            <w:tcW w:type="dxa" w:w="2040"/>
+            <w:gridSpan w:val="2"/>
+          </w:tcPr>
           <w:p>
             <w:pPr>
               <w:pStyle w:val="Compact"/>
@@ -16116,7 +16120,10 @@
           </w:p>
         </w:tc>
         <w:tc>
-          <w:tcPr/>
+          <w:tcPr>
+            <w:tcW w:type="dxa" w:w="2040"/>
+            <w:gridSpan w:val="2"/>
+          </w:tcPr>
           <w:p>
             <w:pPr>
               <w:pStyle w:val="Compact"/>
@@ -16128,7 +16135,10 @@
           </w:p>
         </w:tc>
         <w:tc>
-          <w:tcPr/>
+          <w:tcPr>
+            <w:tcW w:type="dxa" w:w="2551"/>
+            <w:gridSpan w:val="2"/>
+          </w:tcPr>
           <w:p>
             <w:pPr>
               <w:pStyle w:val="Compact"/>
@@ -16142,7 +16152,9 @@
       </w:tr>
       <w:tr>
         <w:tc>
-          <w:tcPr/>
+          <w:tcPr>
+            <w:tcW w:type="dxa" w:w="2580"/>
+          </w:tcPr>
           <w:p>
             <w:pPr>
               <w:pStyle w:val="Compact"/>
@@ -16174,7 +16186,10 @@
           </w:p>
         </w:tc>
         <w:tc>
-          <w:tcPr/>
+          <w:tcPr>
+            <w:tcW w:type="dxa" w:w="2040"/>
+            <w:gridSpan w:val="2"/>
+          </w:tcPr>
           <w:p>
             <w:pPr>
               <w:pStyle w:val="Compact"/>
@@ -16186,7 +16201,10 @@
           </w:p>
         </w:tc>
         <w:tc>
-          <w:tcPr/>
+          <w:tcPr>
+            <w:tcW w:type="dxa" w:w="2040"/>
+            <w:gridSpan w:val="2"/>
+          </w:tcPr>
           <w:p>
             <w:pPr>
               <w:pStyle w:val="Compact"/>
@@ -16198,7 +16216,10 @@
           </w:p>
         </w:tc>
         <w:tc>
-          <w:tcPr/>
+          <w:tcPr>
+            <w:tcW w:type="dxa" w:w="2551"/>
+            <w:gridSpan w:val="2"/>
+          </w:tcPr>
           <w:p>
             <w:pPr>
               <w:pStyle w:val="Compact"/>
@@ -16212,7 +16233,9 @@
       </w:tr>
       <w:tr>
         <w:tc>
-          <w:tcPr/>
+          <w:tcPr>
+            <w:tcW w:type="dxa" w:w="2580"/>
+          </w:tcPr>
           <w:p>
             <w:pPr>
               <w:pStyle w:val="Compact"/>
@@ -16244,7 +16267,10 @@
           </w:p>
         </w:tc>
         <w:tc>
-          <w:tcPr/>
+          <w:tcPr>
+            <w:tcW w:type="dxa" w:w="2040"/>
+            <w:gridSpan w:val="2"/>
+          </w:tcPr>
           <w:p>
             <w:pPr>
               <w:pStyle w:val="Compact"/>
@@ -16256,7 +16282,10 @@
           </w:p>
         </w:tc>
         <w:tc>
-          <w:tcPr/>
+          <w:tcPr>
+            <w:tcW w:type="dxa" w:w="2040"/>
+            <w:gridSpan w:val="2"/>
+          </w:tcPr>
           <w:p>
             <w:pPr>
               <w:pStyle w:val="Compact"/>
@@ -16268,7 +16297,10 @@
           </w:p>
         </w:tc>
         <w:tc>
-          <w:tcPr/>
+          <w:tcPr>
+            <w:tcW w:type="dxa" w:w="2551"/>
+            <w:gridSpan w:val="2"/>
+          </w:tcPr>
           <w:p>
             <w:pPr>
               <w:pStyle w:val="Compact"/>
@@ -16282,7 +16314,9 @@
       </w:tr>
       <w:tr>
         <w:tc>
-          <w:tcPr/>
+          <w:tcPr>
+            <w:tcW w:type="dxa" w:w="2580"/>
+          </w:tcPr>
           <w:p>
             <w:pPr>
               <w:pStyle w:val="Compact"/>
@@ -16314,7 +16348,10 @@
           </w:p>
         </w:tc>
         <w:tc>
-          <w:tcPr/>
+          <w:tcPr>
+            <w:tcW w:type="dxa" w:w="2040"/>
+            <w:gridSpan w:val="2"/>
+          </w:tcPr>
           <w:p>
             <w:pPr>
               <w:pStyle w:val="Compact"/>
@@ -16326,7 +16363,10 @@
           </w:p>
         </w:tc>
         <w:tc>
-          <w:tcPr/>
+          <w:tcPr>
+            <w:tcW w:type="dxa" w:w="2040"/>
+            <w:gridSpan w:val="2"/>
+          </w:tcPr>
           <w:p>
             <w:pPr>
               <w:pStyle w:val="Compact"/>
@@ -16338,7 +16378,10 @@
           </w:p>
         </w:tc>
         <w:tc>
-          <w:tcPr/>
+          <w:tcPr>
+            <w:tcW w:type="dxa" w:w="2551"/>
+            <w:gridSpan w:val="2"/>
+          </w:tcPr>
           <w:p>
             <w:pPr>
               <w:pStyle w:val="Compact"/>
@@ -16352,7 +16395,9 @@
       </w:tr>
       <w:tr>
         <w:tc>
-          <w:tcPr/>
+          <w:tcPr>
+            <w:tcW w:type="dxa" w:w="2580"/>
+          </w:tcPr>
           <w:p>
             <w:pPr>
               <w:pStyle w:val="Compact"/>
@@ -16364,7 +16409,10 @@
           </w:p>
         </w:tc>
         <w:tc>
-          <w:tcPr/>
+          <w:tcPr>
+            <w:tcW w:type="dxa" w:w="2040"/>
+            <w:gridSpan w:val="2"/>
+          </w:tcPr>
           <w:p>
             <w:pPr>
               <w:pStyle w:val="Compact"/>
@@ -16376,7 +16424,10 @@
           </w:p>
         </w:tc>
         <w:tc>
-          <w:tcPr/>
+          <w:tcPr>
+            <w:tcW w:type="dxa" w:w="2040"/>
+            <w:gridSpan w:val="2"/>
+          </w:tcPr>
           <w:p>
             <w:pPr>
               <w:pStyle w:val="Compact"/>
@@ -16388,7 +16439,10 @@
           </w:p>
         </w:tc>
         <w:tc>
-          <w:tcPr/>
+          <w:tcPr>
+            <w:tcW w:type="dxa" w:w="2551"/>
+            <w:gridSpan w:val="2"/>
+          </w:tcPr>
           <w:p>
             <w:pPr>
               <w:pStyle w:val="Compact"/>
@@ -16402,57 +16456,81 @@
       </w:tr>
       <w:tr>
         <w:tc>
-          <w:tcPr/>
-          <w:p>
-            <w:pPr>
-              <w:pStyle w:val="Compact"/>
-              <w:jc w:val="left"/>
-            </w:pPr>
-            <w:r>
-              <w:t xml:space="preserve">Test season</w:t>
-            </w:r>
-          </w:p>
-        </w:tc>
-        <w:tc>
-          <w:tcPr/>
-          <w:p>
-            <w:pPr>
-              <w:pStyle w:val="Compact"/>
-              <w:jc w:val="center"/>
-            </w:pPr>
-            <w:r>
-              <w:t xml:space="preserve">2020</w:t>
-            </w:r>
-          </w:p>
-        </w:tc>
-        <w:tc>
-          <w:tcPr/>
-          <w:p>
-            <w:pPr>
-              <w:pStyle w:val="Compact"/>
-              <w:jc w:val="center"/>
-            </w:pPr>
-            <w:r>
-              <w:t xml:space="preserve">2022</w:t>
-            </w:r>
-          </w:p>
-        </w:tc>
-        <w:tc>
-          <w:tcPr/>
-          <w:p>
-            <w:pPr>
-              <w:pStyle w:val="Compact"/>
-              <w:jc w:val="center"/>
-            </w:pPr>
-            <w:r>
-              <w:t xml:space="preserve">Mean Violations</w:t>
+          <w:tcPr>
+            <w:tcW w:type="dxa" w:w="2580"/>
+          </w:tcPr>
+          <w:p>
+            <w:r>
+              <w:t>Test season</w:t>
+            </w:r>
+          </w:p>
+        </w:tc>
+        <w:tc>
+          <w:tcPr>
+            <w:tcW w:type="dxa" w:w="1020"/>
+          </w:tcPr>
+          <w:p>
+            <w:r>
+              <w:t>2020</w:t>
+            </w:r>
+          </w:p>
+        </w:tc>
+        <w:tc>
+          <w:tcPr>
+            <w:tcW w:type="dxa" w:w="1020"/>
+          </w:tcPr>
+          <w:p>
+            <w:r>
+              <w:t>2021</w:t>
+            </w:r>
+          </w:p>
+        </w:tc>
+        <w:tc>
+          <w:tcPr>
+            <w:tcW w:type="dxa" w:w="1020"/>
+          </w:tcPr>
+          <w:p>
+            <w:r>
+              <w:t>2022</w:t>
+            </w:r>
+          </w:p>
+        </w:tc>
+        <w:tc>
+          <w:tcPr>
+            <w:tcW w:type="dxa" w:w="1020"/>
+          </w:tcPr>
+          <w:p>
+            <w:r>
+              <w:t>2023</w:t>
+            </w:r>
+          </w:p>
+        </w:tc>
+        <w:tc>
+          <w:tcPr>
+            <w:tcW w:type="dxa" w:w="1020"/>
+          </w:tcPr>
+          <w:p>
+            <w:r>
+              <w:t>Mean</w:t>
+            </w:r>
+          </w:p>
+        </w:tc>
+        <w:tc>
+          <w:tcPr>
+            <w:tcW w:type="dxa" w:w="1531"/>
+          </w:tcPr>
+          <w:p>
+            <w:r>
+              <w:t>Violations</w:t>
             </w:r>
           </w:p>
         </w:tc>
       </w:tr>
       <w:tr>
         <w:tc>
-          <w:tcPr/>
+          <w:tcPr>
+            <w:tcW w:type="dxa" w:w="2580"/>
+          </w:tcPr>
           <w:p>
             <w:pPr>
               <w:pStyle w:val="Compact"/>
@@ -16464,12 +16542,10 @@
           </w:p>
         </w:tc>
         <w:tc>
-          <w:tcPr/>
-          <w:p>
-            <w:pPr>
-              <w:pStyle w:val="Compact"/>
-              <w:jc w:val="center"/>
-            </w:pPr>
+          <w:tcPr>
+            <w:tcW w:type="dxa" w:w="1020"/>
+          </w:tcPr>
+          <w:p>
             <m:oMath>
               <m:r>
                 <m:rPr>
@@ -16481,9 +16557,13 @@
                 <m:t>4.63</m:t>
               </m:r>
             </m:oMath>
-            <w:r>
-              <w:t xml:space="preserve"> </w:t>
-            </w:r>
+          </w:p>
+        </w:tc>
+        <w:tc>
+          <w:tcPr>
+            <w:tcW w:type="dxa" w:w="1020"/>
+          </w:tcPr>
+          <w:p>
             <m:oMath>
               <m:r>
                 <m:rPr>
@@ -16498,12 +16578,10 @@
           </w:p>
         </w:tc>
         <w:tc>
-          <w:tcPr/>
-          <w:p>
-            <w:pPr>
-              <w:pStyle w:val="Compact"/>
-              <w:jc w:val="center"/>
-            </w:pPr>
+          <w:tcPr>
+            <w:tcW w:type="dxa" w:w="1020"/>
+          </w:tcPr>
+          <w:p>
             <m:oMath>
               <m:r>
                 <m:rPr>
@@ -16515,9 +16593,13 @@
                 <m:t>1.30</m:t>
               </m:r>
             </m:oMath>
-            <w:r>
-              <w:t xml:space="preserve"> </w:t>
-            </w:r>
+          </w:p>
+        </w:tc>
+        <w:tc>
+          <w:tcPr>
+            <w:tcW w:type="dxa" w:w="1020"/>
+          </w:tcPr>
+          <w:p>
             <m:oMath>
               <m:r>
                 <m:rPr>
@@ -16532,12 +16614,10 @@
           </w:p>
         </w:tc>
         <w:tc>
-          <w:tcPr/>
-          <w:p>
-            <w:pPr>
-              <w:pStyle w:val="Compact"/>
-              <w:jc w:val="center"/>
-            </w:pPr>
+          <w:tcPr>
+            <w:tcW w:type="dxa" w:w="1020"/>
+          </w:tcPr>
+          <w:p>
             <m:oMath>
               <m:r>
                 <m:rPr>
@@ -16549,15 +16629,24 @@
                 <m:t>1.23</m:t>
               </m:r>
             </m:oMath>
-            <w:r>
-              <w:t xml:space="preserve">​</w:t>
+          </w:p>
+        </w:tc>
+        <w:tc>
+          <w:tcPr>
+            <w:tcW w:type="dxa" w:w="1531"/>
+          </w:tcPr>
+          <w:p>
+            <w:r>
+              <w:t>2813</w:t>
             </w:r>
           </w:p>
         </w:tc>
       </w:tr>
       <w:tr>
         <w:tc>
-          <w:tcPr/>
+          <w:tcPr>
+            <w:tcW w:type="dxa" w:w="2580"/>
+          </w:tcPr>
           <w:p>
             <w:pPr>
               <w:pStyle w:val="Compact"/>
@@ -16569,12 +16658,10 @@
           </w:p>
         </w:tc>
         <w:tc>
-          <w:tcPr/>
-          <w:p>
-            <w:pPr>
-              <w:pStyle w:val="Compact"/>
-              <w:jc w:val="center"/>
-            </w:pPr>
+          <w:tcPr>
+            <w:tcW w:type="dxa" w:w="1020"/>
+          </w:tcPr>
+          <w:p>
             <m:oMath>
               <m:r>
                 <m:rPr>
@@ -16586,9 +16673,13 @@
                 <m:t>6.29</m:t>
               </m:r>
             </m:oMath>
-            <w:r>
-              <w:t xml:space="preserve"> </w:t>
-            </w:r>
+          </w:p>
+        </w:tc>
+        <w:tc>
+          <w:tcPr>
+            <w:tcW w:type="dxa" w:w="1020"/>
+          </w:tcPr>
+          <w:p>
             <m:oMath>
               <m:r>
                 <m:rPr>
@@ -16603,12 +16694,10 @@
           </w:p>
         </w:tc>
         <w:tc>
-          <w:tcPr/>
-          <w:p>
-            <w:pPr>
-              <w:pStyle w:val="Compact"/>
-              <w:jc w:val="center"/>
-            </w:pPr>
+          <w:tcPr>
+            <w:tcW w:type="dxa" w:w="1020"/>
+          </w:tcPr>
+          <w:p>
             <m:oMath>
               <m:r>
                 <m:rPr>
@@ -16620,9 +16709,13 @@
                 <m:t>2.81</m:t>
               </m:r>
             </m:oMath>
-            <w:r>
-              <w:t xml:space="preserve"> </w:t>
-            </w:r>
+          </w:p>
+        </w:tc>
+        <w:tc>
+          <w:tcPr>
+            <w:tcW w:type="dxa" w:w="1020"/>
+          </w:tcPr>
+          <w:p>
             <m:oMath>
               <m:r>
                 <m:rPr>
@@ -16637,12 +16730,10 @@
           </w:p>
         </w:tc>
         <w:tc>
-          <w:tcPr/>
-          <w:p>
-            <w:pPr>
-              <w:pStyle w:val="Compact"/>
-              <w:jc w:val="center"/>
-            </w:pPr>
+          <w:tcPr>
+            <w:tcW w:type="dxa" w:w="1020"/>
+          </w:tcPr>
+          <w:p>
             <m:oMath>
               <m:r>
                 <m:rPr>
@@ -16657,15 +16748,24 @@
                 <m:t>2.26</m:t>
               </m:r>
             </m:oMath>
-            <w:r>
-              <w:t xml:space="preserve">​</w:t>
+          </w:p>
+        </w:tc>
+        <w:tc>
+          <w:tcPr>
+            <w:tcW w:type="dxa" w:w="1531"/>
+          </w:tcPr>
+          <w:p>
+            <w:r>
+              <w:t>4339</w:t>
             </w:r>
           </w:p>
         </w:tc>
       </w:tr>
       <w:tr>
         <w:tc>
-          <w:tcPr/>
+          <w:tcPr>
+            <w:tcW w:type="dxa" w:w="2580"/>
+          </w:tcPr>
           <w:p>
             <w:pPr>
               <w:pStyle w:val="Compact"/>
@@ -16677,12 +16777,10 @@
           </w:p>
         </w:tc>
         <w:tc>
-          <w:tcPr/>
-          <w:p>
-            <w:pPr>
-              <w:pStyle w:val="Compact"/>
-              <w:jc w:val="center"/>
-            </w:pPr>
+          <w:tcPr>
+            <w:tcW w:type="dxa" w:w="1020"/>
+          </w:tcPr>
+          <w:p>
             <m:oMath>
               <m:r>
                 <m:rPr>
@@ -16694,9 +16792,13 @@
                 <m:t>1.66</m:t>
               </m:r>
             </m:oMath>
-            <w:r>
-              <w:t xml:space="preserve"> </w:t>
-            </w:r>
+          </w:p>
+        </w:tc>
+        <w:tc>
+          <w:tcPr>
+            <w:tcW w:type="dxa" w:w="1020"/>
+          </w:tcPr>
+          <w:p>
             <m:oMath>
               <m:r>
                 <m:rPr>
@@ -16711,12 +16813,10 @@
           </w:p>
         </w:tc>
         <w:tc>
-          <w:tcPr/>
-          <w:p>
-            <w:pPr>
-              <w:pStyle w:val="Compact"/>
-              <w:jc w:val="center"/>
-            </w:pPr>
+          <w:tcPr>
+            <w:tcW w:type="dxa" w:w="1020"/>
+          </w:tcPr>
+          <w:p>
             <m:oMath>
               <m:r>
                 <m:rPr>
@@ -16728,9 +16828,13 @@
                 <m:t>1.50</m:t>
               </m:r>
             </m:oMath>
-            <w:r>
-              <w:t xml:space="preserve"> </w:t>
-            </w:r>
+          </w:p>
+        </w:tc>
+        <w:tc>
+          <w:tcPr>
+            <w:tcW w:type="dxa" w:w="1020"/>
+          </w:tcPr>
+          <w:p>
             <m:oMath>
               <m:r>
                 <m:rPr>
@@ -16745,12 +16849,10 @@
           </w:p>
         </w:tc>
         <w:tc>
-          <w:tcPr/>
-          <w:p>
-            <w:pPr>
-              <w:pStyle w:val="Compact"/>
-              <w:jc w:val="center"/>
-            </w:pPr>
+          <w:tcPr>
+            <w:tcW w:type="dxa" w:w="1020"/>
+          </w:tcPr>
+          <w:p>
             <m:oMath>
               <m:r>
                 <m:rPr>
@@ -16765,9 +16867,13 @@
                 <m:t>3.49</m:t>
               </m:r>
             </m:oMath>
-            <w:r>
-              <w:t xml:space="preserve"> </w:t>
-            </w:r>
+          </w:p>
+        </w:tc>
+        <w:tc>
+          <w:tcPr>
+            <w:tcW w:type="dxa" w:w="1531"/>
+          </w:tcPr>
+          <w:p>
             <m:oMath>
               <m:r>
                 <m:rPr>
@@ -50556,7 +50662,7 @@
         <w:t xml:space="preserve"> </w:t>
       </w:r>
       <w:r>
-        <w:t xml:space="preserve">archived replication package. EPI is the</w:t>
+        <w:t xml:space="preserve">public replication tree. EPI is the</w:t>
       </w:r>
       <w:r>
         <w:t xml:space="preserve"> </w:t>
@@ -53147,25 +53253,39 @@
         <w:t xml:space="preserve"> </w:t>
       </w:r>
       <w:r>
-        <w:t xml:space="preserve">[[REQUIRED BEFORE SUBMISSION: a public, citable location for this</w:t>
-      </w:r>
-      <w:r>
-        <w:t xml:space="preserve"> </w:t>
-      </w:r>
-      <w:r>
-        <w:t xml:space="preserve">tree – a repository URL and an archived release with a DOI (Zenodo, figshare or</w:t>
-      </w:r>
-      <w:r>
-        <w:t xml:space="preserve"> </w:t>
-      </w:r>
-      <w:r>
-        <w:t xml:space="preserve">equivalent). MDPI requires a link or an explicit statement of restriction; a path</w:t>
-      </w:r>
-      <w:r>
-        <w:t xml:space="preserve"> </w:t>
-      </w:r>
-      <w:r>
-        <w:t xml:space="preserve">inside a private repository is not sufficient.]]</w:t>
+        <w:t xml:space="preserve"/>
+      </w:r>
+      <w:r>
+        <w:t xml:space="preserve"/>
+      </w:r>
+      <w:r>
+        <w:t xml:space="preserve"/>
+      </w:r>
+      <w:r>
+        <w:t xml:space="preserve"/>
+      </w:r>
+      <w:r>
+        <w:t xml:space="preserve"/>
+      </w:r>
+      <w:r>
+        <w:t xml:space="preserve"/>
+      </w:r>
+      <w:r>
+        <w:t xml:space="preserve"/>
+      </w:r>
+      <w:r>
+        <w:t xml:space="preserve">The complete replication tree is openly available at </w:t>
+      </w:r>
+      <w:hyperlink r:id="rId1">
+        <w:r>
+          <w:rPr>
+            <w:rStyle w:val="Hyperlink"/>
+          </w:rPr>
+          <w:t>https://github.com/chernyaevantont-tech/greenhouse-control/tree/516e167920bd060a33c7a311d504ee54529c769b/own-article</w:t>
+        </w:r>
+      </w:hyperlink>
+      <w:r>
+        <w:t>, fixed to the commit identified in the URL.</w:t>
       </w:r>
     </w:p>
     <w:p>

</xml_diff>